<commit_message>
feat(demo): expand synthetic scenario library
</commit_message>
<xml_diff>
--- a/demo/cybersafeadvisor-corporate-pack/support-brew-bloom-termination-communications-and-work-plan.docx
+++ b/demo/cybersafeadvisor-corporate-pack/support-brew-bloom-termination-communications-and-work-plan.docx
@@ -125,6 +125,11 @@
     <w:p>
       <w:r>
         <w:t>Client email: Taylor Brooks asked counsel to prioritize the immediate decision and summarize remaining information gaps.</w:t>
+      </w:r>
+    </w:p>
+    <w:p>
+      <w:r>
+        <w:t>Follow-up call: Jules Grant confirmed the records owner and the preferred review cadence.</w:t>
       </w:r>
     </w:p>
     <w:p>

</xml_diff>